<commit_message>
Updated schedule and planning worksheet, part of issue #10
</commit_message>
<xml_diff>
--- a/Documents/Planning_Worksheet.docx
+++ b/Documents/Planning_Worksheet.docx
@@ -68,6 +68,9 @@
       <w:r>
         <w:t xml:space="preserve"> Your primary mentor(s)</w:t>
       </w:r>
+      <w:r>
+        <w:t>.  You could have more than one.</w:t>
+      </w:r>
     </w:p>
     <w:p>
       <w:pPr>
@@ -108,7 +111,13 @@
         <w:t>PAF:</w:t>
       </w:r>
       <w:r>
-        <w:t xml:space="preserve"> Proposal approval form.</w:t>
+        <w:t xml:space="preserve"> Proposal approval form</w:t>
+      </w:r>
+      <w:r>
+        <w:t>, this helps the grants administrators work on your fellowship</w:t>
+      </w:r>
+      <w:r>
+        <w:t>.</w:t>
       </w:r>
     </w:p>
     <w:p>
@@ -129,7 +138,13 @@
         </w:numPr>
       </w:pPr>
       <w:r>
-        <w:t xml:space="preserve">Find the Funding Announcement and Save it in a Folder.   </w:t>
+        <w:t xml:space="preserve">Find </w:t>
+      </w:r>
+      <w:r>
+        <w:t>the correct</w:t>
+      </w:r>
+      <w:r>
+        <w:t xml:space="preserve"> Funding Announcement and Save it in a Folder.   </w:t>
       </w:r>
     </w:p>
     <w:p>
@@ -141,30 +156,99 @@
         </w:numPr>
       </w:pPr>
       <w:r>
-        <w:t xml:space="preserve">For most NIH F31’s it is </w:t>
+        <w:t xml:space="preserve">If you are a predoc </w:t>
+      </w:r>
+      <w:r>
+        <w:t xml:space="preserve">- F31 </w:t>
       </w:r>
       <w:hyperlink r:id="rId5" w:history="1">
         <w:r>
           <w:rPr>
             <w:rStyle w:val="Hyperlink"/>
           </w:rPr>
-          <w:t>https://grants.nih.gov/grants/guide/pa-files/PA-23-272.html</w:t>
+          <w:t>https://grants.nih.gov/grants/guide/pa</w:t>
+        </w:r>
+        <w:r>
+          <w:rPr>
+            <w:rStyle w:val="Hyperlink"/>
+          </w:rPr>
+          <w:t>-</w:t>
+        </w:r>
+        <w:r>
+          <w:rPr>
+            <w:rStyle w:val="Hyperlink"/>
+          </w:rPr>
+          <w:t>files/PA-25-422.html</w:t>
         </w:r>
       </w:hyperlink>
-      <w:r>
-        <w:t xml:space="preserve"> but for some people </w:t>
+    </w:p>
+    <w:p>
+      <w:pPr>
+        <w:pStyle w:val="ListParagraph"/>
+        <w:numPr>
+          <w:ilvl w:val="0"/>
+          <w:numId w:val="3"/>
+        </w:numPr>
+      </w:pPr>
+      <w:r>
+        <w:t xml:space="preserve">If you are a postdoc - </w:t>
+      </w:r>
+      <w:r>
+        <w:t>F32</w:t>
+      </w:r>
+      <w:r>
+        <w:t xml:space="preserve"> </w:t>
       </w:r>
       <w:hyperlink r:id="rId6" w:history="1">
         <w:r>
           <w:rPr>
             <w:rStyle w:val="Hyperlink"/>
           </w:rPr>
-          <w:t>https://grants.nih.gov/grants/guide/pa-files/PA-23-271.html</w:t>
+          <w:t>https</w:t>
+        </w:r>
+        <w:r>
+          <w:rPr>
+            <w:rStyle w:val="Hyperlink"/>
+          </w:rPr>
+          <w:t>://gran</w:t>
+        </w:r>
+        <w:r>
+          <w:rPr>
+            <w:rStyle w:val="Hyperlink"/>
+          </w:rPr>
+          <w:t>t</w:t>
+        </w:r>
+        <w:r>
+          <w:rPr>
+            <w:rStyle w:val="Hyperlink"/>
+          </w:rPr>
+          <w:t>s.nih.gov/</w:t>
+        </w:r>
+        <w:r>
+          <w:rPr>
+            <w:rStyle w:val="Hyperlink"/>
+          </w:rPr>
+          <w:t>g</w:t>
+        </w:r>
+        <w:r>
+          <w:rPr>
+            <w:rStyle w:val="Hyperlink"/>
+          </w:rPr>
+          <w:t>rants/guide/pa-files/PAR-25-2</w:t>
+        </w:r>
+        <w:r>
+          <w:rPr>
+            <w:rStyle w:val="Hyperlink"/>
+          </w:rPr>
+          <w:t>3</w:t>
+        </w:r>
+        <w:r>
+          <w:rPr>
+            <w:rStyle w:val="Hyperlink"/>
+          </w:rPr>
+          <w:t>4.html</w:t>
         </w:r>
       </w:hyperlink>
-      <w:r>
-        <w:t xml:space="preserve"> is more appropriate</w:t>
-      </w:r>
     </w:p>
     <w:p>
       <w:pPr>
@@ -176,6 +260,9 @@
       </w:pPr>
       <w:r>
         <w:t xml:space="preserve">You will apply to a specific NIH institute.  </w:t>
+      </w:r>
+      <w:r>
+        <w:t xml:space="preserve">For many of you this will be NIDDK.  </w:t>
       </w:r>
       <w:r>
         <w:t xml:space="preserve">If you aren’t sure look at NIH Reporter for similar projects </w:t>
@@ -193,6 +280,9 @@
       </w:r>
       <w:r>
         <w:t>.</w:t>
+      </w:r>
+      <w:r>
+        <w:t xml:space="preserve">  Make sure they are listed as participating on the PA</w:t>
       </w:r>
     </w:p>
     <w:p>
@@ -313,15 +403,13 @@
           </w:tcPr>
           <w:p>
             <w:r>
-              <w:t xml:space="preserve">Am I </w:t>
-            </w:r>
-            <w:proofErr w:type="spellStart"/>
-            <w:r>
-              <w:t>eligble</w:t>
-            </w:r>
-            <w:proofErr w:type="spellEnd"/>
-            <w:r>
-              <w:t xml:space="preserve"> for this PA?</w:t>
+              <w:t>Am I elig</w:t>
+            </w:r>
+            <w:r>
+              <w:t>i</w:t>
+            </w:r>
+            <w:r>
+              <w:t>ble for this PA?</w:t>
             </w:r>
           </w:p>
         </w:tc>
@@ -523,7 +611,13 @@
           </w:tcPr>
           <w:p>
             <w:r>
-              <w:t>Who are my sponsors?</w:t>
+              <w:t>Who are my sponsors</w:t>
+            </w:r>
+            <w:r>
+              <w:t xml:space="preserve"> (mentors)</w:t>
+            </w:r>
+            <w:r>
+              <w:t>?</w:t>
             </w:r>
           </w:p>
         </w:tc>
@@ -549,7 +643,13 @@
               <w:t>Who else is going to support my training or research</w:t>
             </w:r>
             <w:r>
-              <w:t xml:space="preserve"> (mentors/coinvestigators)</w:t>
+              <w:t xml:space="preserve"> (</w:t>
+            </w:r>
+            <w:r>
+              <w:t>collaborators</w:t>
+            </w:r>
+            <w:r>
+              <w:t>/coinvestigators)</w:t>
             </w:r>
             <w:r>
               <w:t>?</w:t>
@@ -1770,6 +1870,18 @@
       </w:tcPr>
     </w:tblStylePr>
   </w:style>
+  <w:style w:type="character" w:styleId="FollowedHyperlink">
+    <w:name w:val="FollowedHyperlink"/>
+    <w:basedOn w:val="DefaultParagraphFont"/>
+    <w:uiPriority w:val="99"/>
+    <w:semiHidden/>
+    <w:unhideWhenUsed/>
+    <w:rsid w:val="00165B6D"/>
+    <w:rPr>
+      <w:color w:val="954F72" w:themeColor="followedHyperlink"/>
+      <w:u w:val="single"/>
+    </w:rPr>
+  </w:style>
 </w:styles>
 </file>
 

</xml_diff>